<commit_message>
chore: mark as not available for new roles
- Hero, contact and terminal availability line now reads "Not available
  for new roles right now"; nav and status-bar pills say "Not available".
- Availability dots and pill switch from green to amber.
- Drop the "currently exploring roles" sentence from the intro and the
  role pitch from the contact CTA.
- Resume: remove the relocation/visa line and the notice period
  (web + regenerated universal DOCX).

Co-Authored-By: Claude Opus 5.5 <noreply@anthropic.com>
Claude-Session: https://claude.ai/code/session_01FBqDFKtUjNxLinMN5kyHPx
</commit_message>
<xml_diff>
--- a/public/downloads/anirudh-vaka-resume-universal.docx
+++ b/public/downloads/anirudh-vaka-resume-universal.docx
@@ -39,7 +39,7 @@
       <w:pPr>
         <w:spacing w:after="40"/>
       </w:pPr>
-      <w:hyperlink w:history="1" r:id="rIdq2urqaqcuv2e3be4peo10">
+      <w:hyperlink w:history="1" r:id="rId14zj_d-4k0qinw7nfqrcw">
         <w:r>
           <w:rPr>
             <w:u w:val="single"/>
@@ -60,7 +60,7 @@
         </w:rPr>
         <w:t xml:space="preserve"> | </w:t>
       </w:r>
-      <w:hyperlink w:history="1" r:id="rIdevt22ogqb6kwtrhh5-zzn">
+      <w:hyperlink w:history="1" r:id="rIdrcod2mgwkl7hlfnubsd1h">
         <w:r>
           <w:rPr>
             <w:u w:val="single"/>
@@ -81,7 +81,7 @@
         </w:rPr>
         <w:t xml:space="preserve"> | </w:t>
       </w:r>
-      <w:hyperlink w:history="1" r:id="rId6w_lvnjb9lmxmroj5uxqg">
+      <w:hyperlink w:history="1" r:id="rIdffxhw8hh-6a_pldiehdtr">
         <w:r>
           <w:rPr>
             <w:u w:val="single"/>
@@ -116,7 +116,7 @@
         </w:rPr>
         <w:t xml:space="preserve"> | </w:t>
       </w:r>
-      <w:hyperlink w:history="1" r:id="rId3lktl6ebhtb3egjpjo56h">
+      <w:hyperlink w:history="1" r:id="rIdhdhdkiirktvjzihhrwoev">
         <w:r>
           <w:rPr>
             <w:u w:val="single"/>
@@ -137,7 +137,7 @@
         </w:rPr>
         <w:t xml:space="preserve"> | </w:t>
       </w:r>
-      <w:hyperlink w:history="1" r:id="rIdppcscibxbd1qb8tip1yn8">
+      <w:hyperlink w:history="1" r:id="rIdcydsuf0xfpj0m8y7ltnsu">
         <w:r>
           <w:rPr>
             <w:u w:val="single"/>
@@ -152,22 +152,6 @@
     </w:p>
     <w:p>
       <w:pPr>
-        <w:spacing w:after="40"/>
-      </w:pPr>
-      <w:r>
-        <w:rPr>
-          <w:i/>
-          <w:iCs/>
-          <w:color w:val="4A4A6A"/>
-          <w:sz w:val="20"/>
-          <w:szCs w:val="20"/>
-          <w:rFonts w:ascii="Calibri" w:cs="Calibri" w:eastAsia="Calibri" w:hAnsi="Calibri"/>
-        </w:rPr>
-        <w:t xml:space="preserve">Open to relocation worldwide with visa sponsorship, or fully remote · Notice period: Serving notice — last working day 22 Oct 2026</w:t>
-      </w:r>
-    </w:p>
-    <w:p>
-      <w:pPr>
         <w:pBdr>
           <w:bottom w:val="single" w:color="D0D5E8" w:sz="6" w:space="1"/>
         </w:pBdr>
@@ -909,7 +893,7 @@
         </w:rPr>
         <w:t xml:space="preserve">Founder &amp; Engineer — </w:t>
       </w:r>
-      <w:hyperlink w:history="1" r:id="rIdervh38vykr-btd_9zj3e4">
+      <w:hyperlink w:history="1" r:id="rIdszfkmdkl8weocpmdphadi">
         <w:r>
           <w:rPr>
             <w:b/>
@@ -974,7 +958,7 @@
         </w:rPr>
         <w:t xml:space="preserve">Founder &amp; Engineer — </w:t>
       </w:r>
-      <w:hyperlink w:history="1" r:id="rIdqhggcotcpeq_hregg0_1z">
+      <w:hyperlink w:history="1" r:id="rIdkcwsx2gul7rbspb-whfkp">
         <w:r>
           <w:rPr>
             <w:b/>

</xml_diff>

<commit_message>
Remove mobile number from the portfolio
Drop the phone field from the resume contact data and every place
that rendered it: the site footer, the contact terminal, the /resume
header, and the generated Word resume (regenerated here).

Co-Authored-By: Claude Opus 5.5 <noreply@anthropic.com>
Claude-Session: https://claude.ai/code/session_01GqxmgexFKXhZZPMnzdtFsk
</commit_message>
<xml_diff>
--- a/public/downloads/anirudh-vaka-resume-universal.docx
+++ b/public/downloads/anirudh-vaka-resume-universal.docx
@@ -39,7 +39,7 @@
       <w:pPr>
         <w:spacing w:after="40"/>
       </w:pPr>
-      <w:hyperlink w:history="1" r:id="rId14zj_d-4k0qinw7nfqrcw">
+      <w:hyperlink w:history="1" r:id="rIdiisdmminy_xvugprz-v0f">
         <w:r>
           <w:rPr>
             <w:u w:val="single"/>
@@ -60,28 +60,7 @@
         </w:rPr>
         <w:t xml:space="preserve"> | </w:t>
       </w:r>
-      <w:hyperlink w:history="1" r:id="rIdrcod2mgwkl7hlfnubsd1h">
-        <w:r>
-          <w:rPr>
-            <w:u w:val="single"/>
-            <w:color w:val="1A56DB"/>
-            <w:sz w:val="20"/>
-            <w:szCs w:val="20"/>
-            <w:rFonts w:ascii="Calibri" w:cs="Calibri" w:eastAsia="Calibri" w:hAnsi="Calibri"/>
-          </w:rPr>
-          <w:t xml:space="preserve">+91 79817 30312</w:t>
-        </w:r>
-      </w:hyperlink>
-      <w:r>
-        <w:rPr>
-          <w:color w:val="4A4A6A"/>
-          <w:sz w:val="20"/>
-          <w:szCs w:val="20"/>
-          <w:rFonts w:ascii="Calibri" w:cs="Calibri" w:eastAsia="Calibri" w:hAnsi="Calibri"/>
-        </w:rPr>
-        <w:t xml:space="preserve"> | </w:t>
-      </w:r>
-      <w:hyperlink w:history="1" r:id="rIdffxhw8hh-6a_pldiehdtr">
+      <w:hyperlink w:history="1" r:id="rIdaermvgfnygmmm81o1v5cz">
         <w:r>
           <w:rPr>
             <w:u w:val="single"/>
@@ -116,7 +95,7 @@
         </w:rPr>
         <w:t xml:space="preserve"> | </w:t>
       </w:r>
-      <w:hyperlink w:history="1" r:id="rIdhdhdkiirktvjzihhrwoev">
+      <w:hyperlink w:history="1" r:id="rIdtmmhgoyli1vkh5elpih4w">
         <w:r>
           <w:rPr>
             <w:u w:val="single"/>
@@ -137,7 +116,7 @@
         </w:rPr>
         <w:t xml:space="preserve"> | </w:t>
       </w:r>
-      <w:hyperlink w:history="1" r:id="rIdcydsuf0xfpj0m8y7ltnsu">
+      <w:hyperlink w:history="1" r:id="rIdnso9u8t0mlhwh9hwft9yc">
         <w:r>
           <w:rPr>
             <w:u w:val="single"/>
@@ -893,7 +872,7 @@
         </w:rPr>
         <w:t xml:space="preserve">Founder &amp; Engineer — </w:t>
       </w:r>
-      <w:hyperlink w:history="1" r:id="rIdszfkmdkl8weocpmdphadi">
+      <w:hyperlink w:history="1" r:id="rId2tendzqmng4pxdi1jdt1h">
         <w:r>
           <w:rPr>
             <w:b/>
@@ -958,7 +937,7 @@
         </w:rPr>
         <w:t xml:space="preserve">Founder &amp; Engineer — </w:t>
       </w:r>
-      <w:hyperlink w:history="1" r:id="rIdkcwsx2gul7rbspb-whfkp">
+      <w:hyperlink w:history="1" r:id="rIdqfqd7scydxwzzljybgbvt">
         <w:r>
           <w:rPr>
             <w:b/>

</xml_diff>

<commit_message>
Remove PrepAtlas and HumanifyCV from the portfolio and resume
Drop both side products everywhere they appeared: the two project cards,
the resume's "Products & Side Projects" section (data, /resume renderer,
DOCX builder, styles), and the founder mentions in the hero, intro copy,
metrics strip, contact terminal, meta descriptions and OG image. The
metrics cell that counted the products now shows the team-lead fact
already stated in the hero. Regenerated the Word resume.

Co-Authored-By: Claude Opus 5.5 <noreply@anthropic.com>
Claude-Session: https://claude.ai/code/session_01RdmR1wzMi66WnHLR14X3wG
</commit_message>
<xml_diff>
--- a/public/downloads/anirudh-vaka-resume-universal.docx
+++ b/public/downloads/anirudh-vaka-resume-universal.docx
@@ -39,7 +39,7 @@
       <w:pPr>
         <w:spacing w:after="40"/>
       </w:pPr>
-      <w:hyperlink w:history="1" r:id="rIdiisdmminy_xvugprz-v0f">
+      <w:hyperlink w:history="1" r:id="rIdgfdvliv45whrmiey_usxp">
         <w:r>
           <w:rPr>
             <w:u w:val="single"/>
@@ -60,7 +60,7 @@
         </w:rPr>
         <w:t xml:space="preserve"> | </w:t>
       </w:r>
-      <w:hyperlink w:history="1" r:id="rIdaermvgfnygmmm81o1v5cz">
+      <w:hyperlink w:history="1" r:id="rIdmcyahrtkrbfmgxd8jw-uu">
         <w:r>
           <w:rPr>
             <w:u w:val="single"/>
@@ -95,7 +95,7 @@
         </w:rPr>
         <w:t xml:space="preserve"> | </w:t>
       </w:r>
-      <w:hyperlink w:history="1" r:id="rIdtmmhgoyli1vkh5elpih4w">
+      <w:hyperlink w:history="1" r:id="rId_knhyucvablhc3miigrt9">
         <w:r>
           <w:rPr>
             <w:u w:val="single"/>
@@ -116,7 +116,7 @@
         </w:rPr>
         <w:t xml:space="preserve"> | </w:t>
       </w:r>
-      <w:hyperlink w:history="1" r:id="rIdnso9u8t0mlhwh9hwft9yc">
+      <w:hyperlink w:history="1" r:id="rIdukggsobucxao3o9e6yi-7">
         <w:r>
           <w:rPr>
             <w:u w:val="single"/>
@@ -160,7 +160,7 @@
           <w:szCs w:val="22"/>
           <w:rFonts w:ascii="Calibri" w:cs="Calibri" w:eastAsia="Calibri" w:hAnsi="Calibri"/>
         </w:rPr>
-        <w:t xml:space="preserve">Senior DevOps / Platform / SRE engineer with 3+ years operating production infrastructure across AWS, Azure, and on-prem Kubernetes — including building an on-prem Kubernetes data center from bare metal at 99.9% uptime for 1000+ customers. Promoted intern → DevOps Lead in under two years; now lead a team of 5 under an ISO 27001:2022-certified practice. Founder of two live AI SaaS products (PrepAtlas, HumanifyCV) with paying users. Strong on Terraform, Kubernetes, GitHub Actions, GitOps, and FinOps — plus a self-hosted LLM platform (Ollama, grounded RAG on pgvector) and an AI-in-SDLC auto-remediation pipeline that cuts MTTR.</w:t>
+        <w:t xml:space="preserve">Senior DevOps / Platform / SRE engineer with 3+ years operating production infrastructure across AWS, Azure, and on-prem Kubernetes — including building an on-prem Kubernetes data center from bare metal at 99.9% uptime for 1000+ customers. Promoted intern → DevOps Lead in under two years; now lead a team of 5 under an ISO 27001:2022-certified practice. Strong on Terraform, Kubernetes, GitHub Actions, GitOps, and FinOps — plus a self-hosted LLM platform (Ollama, grounded RAG on pgvector) and an AI-in-SDLC auto-remediation pipeline that cuts MTTR.</w:t>
       </w:r>
     </w:p>
     <w:p>
@@ -832,156 +832,6 @@
           <w:rFonts w:ascii="Calibri" w:cs="Calibri" w:eastAsia="Calibri" w:hAnsi="Calibri"/>
         </w:rPr>
         <w:t xml:space="preserve">Rotated through support engineering; selected for full-time conversion to DevOps Engineer based on infrastructure work during the rotation.</w:t>
-      </w:r>
-    </w:p>
-    <w:p>
-      <w:pPr>
-        <w:pBdr>
-          <w:bottom w:val="single" w:color="D0D5E8" w:sz="6" w:space="1"/>
-        </w:pBdr>
-        <w:spacing w:before="200" w:after="60"/>
-      </w:pPr>
-      <w:r>
-        <w:rPr>
-          <w:b/>
-          <w:bCs/>
-          <w:color w:val="1A56DB"/>
-          <w:sz w:val="20"/>
-          <w:szCs w:val="20"/>
-          <w:rFonts w:ascii="Calibri" w:cs="Calibri" w:eastAsia="Calibri" w:hAnsi="Calibri"/>
-          <w:spacing w:val="30"/>
-        </w:rPr>
-        <w:t xml:space="preserve">PRODUCTS &amp; SIDE PROJECTS</w:t>
-      </w:r>
-    </w:p>
-    <w:p>
-      <w:pPr>
-        <w:tabs>
-          <w:tab w:val="right" w:pos="9000"/>
-        </w:tabs>
-        <w:spacing w:before="100" w:after="0"/>
-      </w:pPr>
-      <w:r>
-        <w:rPr>
-          <w:b/>
-          <w:bCs/>
-          <w:color w:val="1E1E2E"/>
-          <w:sz w:val="24"/>
-          <w:szCs w:val="24"/>
-          <w:rFonts w:ascii="Calibri" w:cs="Calibri" w:eastAsia="Calibri" w:hAnsi="Calibri"/>
-        </w:rPr>
-        <w:t xml:space="preserve">Founder &amp; Engineer — </w:t>
-      </w:r>
-      <w:hyperlink w:history="1" r:id="rId2tendzqmng4pxdi1jdt1h">
-        <w:r>
-          <w:rPr>
-            <w:b/>
-            <w:bCs/>
-            <w:u w:val="single"/>
-            <w:color w:val="1A56DB"/>
-            <w:sz w:val="24"/>
-            <w:szCs w:val="24"/>
-            <w:rFonts w:ascii="Calibri" w:cs="Calibri" w:eastAsia="Calibri" w:hAnsi="Calibri"/>
-          </w:rPr>
-          <w:t xml:space="preserve">PrepAtlas</w:t>
-        </w:r>
-      </w:hyperlink>
-      <w:r>
-        <w:rPr>
-          <w:color w:val="4A4A6A"/>
-          <w:sz w:val="20"/>
-          <w:szCs w:val="20"/>
-          <w:rFonts w:ascii="Calibri" w:cs="Calibri" w:eastAsia="Calibri" w:hAnsi="Calibri"/>
-        </w:rPr>
-        <w:t xml:space="preserve">  (prepatlas.in)</w:t>
-      </w:r>
-      <w:r>
-        <w:rPr>
-          <w:color w:val="4A4A6A"/>
-          <w:sz w:val="22"/>
-          <w:szCs w:val="22"/>
-          <w:rFonts w:ascii="Calibri" w:cs="Calibri" w:eastAsia="Calibri" w:hAnsi="Calibri"/>
-        </w:rPr>
-        <w:t xml:space="preserve">	Dec 2025 – Present</w:t>
-      </w:r>
-    </w:p>
-    <w:p>
-      <w:pPr>
-        <w:spacing w:after="80" w:line="280"/>
-      </w:pPr>
-      <w:r>
-        <w:rPr>
-          <w:color w:val="4A4A6A"/>
-          <w:sz w:val="22"/>
-          <w:szCs w:val="22"/>
-          <w:rFonts w:ascii="Calibri" w:cs="Calibri" w:eastAsia="Calibri" w:hAnsi="Calibri"/>
-        </w:rPr>
-        <w:t xml:space="preserve">AI learning and career platform for Indian students — an AI tutor teaching over chat, voice, and generated video, adaptive practice, a timed exam engine, and 13 role-based career tracks with mock interviews and JD analysis. Next.js 15 on self-hosted PocketBase with a provider-routed LLM layer (Claude, NVIDIA) behind a per-user token budget and schema-validated output; offline-capable PWA and Android TWA on a $35/month AWS stack, 20+ paying users in beta.</w:t>
-      </w:r>
-    </w:p>
-    <w:p>
-      <w:pPr>
-        <w:tabs>
-          <w:tab w:val="right" w:pos="9000"/>
-        </w:tabs>
-        <w:spacing w:before="100" w:after="0"/>
-      </w:pPr>
-      <w:r>
-        <w:rPr>
-          <w:b/>
-          <w:bCs/>
-          <w:color w:val="1E1E2E"/>
-          <w:sz w:val="24"/>
-          <w:szCs w:val="24"/>
-          <w:rFonts w:ascii="Calibri" w:cs="Calibri" w:eastAsia="Calibri" w:hAnsi="Calibri"/>
-        </w:rPr>
-        <w:t xml:space="preserve">Founder &amp; Engineer — </w:t>
-      </w:r>
-      <w:hyperlink w:history="1" r:id="rIdqfqd7scydxwzzljybgbvt">
-        <w:r>
-          <w:rPr>
-            <w:b/>
-            <w:bCs/>
-            <w:u w:val="single"/>
-            <w:color w:val="1A56DB"/>
-            <w:sz w:val="24"/>
-            <w:szCs w:val="24"/>
-            <w:rFonts w:ascii="Calibri" w:cs="Calibri" w:eastAsia="Calibri" w:hAnsi="Calibri"/>
-          </w:rPr>
-          <w:t xml:space="preserve">HumanifyCV</w:t>
-        </w:r>
-      </w:hyperlink>
-      <w:r>
-        <w:rPr>
-          <w:color w:val="4A4A6A"/>
-          <w:sz w:val="20"/>
-          <w:szCs w:val="20"/>
-          <w:rFonts w:ascii="Calibri" w:cs="Calibri" w:eastAsia="Calibri" w:hAnsi="Calibri"/>
-        </w:rPr>
-        <w:t xml:space="preserve">  (humanifycv.com)</w:t>
-      </w:r>
-      <w:r>
-        <w:rPr>
-          <w:color w:val="4A4A6A"/>
-          <w:sz w:val="22"/>
-          <w:szCs w:val="22"/>
-          <w:rFonts w:ascii="Calibri" w:cs="Calibri" w:eastAsia="Calibri" w:hAnsi="Calibri"/>
-        </w:rPr>
-        <w:t xml:space="preserve">	Jan 2026 – Present</w:t>
-      </w:r>
-    </w:p>
-    <w:p>
-      <w:pPr>
-        <w:spacing w:after="80" w:line="280"/>
-      </w:pPr>
-      <w:r>
-        <w:rPr>
-          <w:color w:val="4A4A6A"/>
-          <w:sz w:val="22"/>
-          <w:szCs w:val="22"/>
-          <w:rFonts w:ascii="Calibri" w:cs="Calibri" w:eastAsia="Calibri" w:hAnsi="Calibri"/>
-        </w:rPr>
-        <w:t xml:space="preserve">AI career workspace built on a structured Career Vault — verified experience stored once, with AI generation, humanisation, and JD tailoring reading from it rather than inventing history, plus ATS analysis, cover letters, and a multi-tenant console for colleges. Next.js 16 + Prisma/Postgres with NextAuth v5 (TOTP 2FA over AES-256-GCM secrets, WebAuthn passkeys), Razorpay, and a multi-model Claude router, deployed by GitHub Actions to Docker Compose on AWS EC2 behind Cloudflare; 30–40 paying users.</w:t>
       </w:r>
     </w:p>
     <w:p>

</xml_diff>